<commit_message>
project X от 17_04_2026
</commit_message>
<xml_diff>
--- a/ЗАПИСКА С ПУНКТАМИ.docx
+++ b/ЗАПИСКА С ПУНКТАМИ.docx
@@ -156,27 +156,6 @@
       <w:r>
         <w:rPr>
           <w:rFonts w:ascii="Times New Roman" w:hAnsi="Times New Roman" w:cs="Times New Roman"/>
-          <w:shd w:val="clear" w:color="auto" w:fill="F1A983" w:themeFill="accent2" w:themeFillTint="99"/>
-        </w:rPr>
-        <w:t>1….</w:t>
-      </w:r>
-      <w:r>
-        <w:rPr>
-          <w:rFonts w:ascii="Times New Roman" w:hAnsi="Times New Roman" w:cs="Times New Roman"/>
-          <w:shd w:val="clear" w:color="auto" w:fill="F1A983" w:themeFill="accent2" w:themeFillTint="99"/>
-        </w:rPr>
-        <w:t xml:space="preserve">Статистические показатели ; </w:t>
-      </w:r>
-      <w:r>
-        <w:rPr>
-          <w:rFonts w:ascii="Times New Roman" w:hAnsi="Times New Roman" w:cs="Times New Roman"/>
-          <w:shd w:val="clear" w:color="auto" w:fill="F1A983" w:themeFill="accent2" w:themeFillTint="99"/>
-        </w:rPr>
-        <w:t>ДИАГНОСТИКА</w:t>
-      </w:r>
-      <w:r>
-        <w:rPr>
-          <w:rFonts w:ascii="Times New Roman" w:hAnsi="Times New Roman" w:cs="Times New Roman"/>
           <w:shd w:val="clear" w:color="auto" w:fill="C1F0C7" w:themeFill="accent3" w:themeFillTint="33"/>
         </w:rPr>
         <w:br/>
@@ -185,56 +164,139 @@
         <w:rPr>
           <w:rFonts w:ascii="Times New Roman" w:hAnsi="Times New Roman" w:cs="Times New Roman"/>
         </w:rPr>
-        <w:t>1.2 Анализ предметной области</w:t>
-      </w:r>
-      <w:r>
-        <w:rPr>
-          <w:rFonts w:ascii="Times New Roman" w:hAnsi="Times New Roman" w:cs="Times New Roman"/>
-        </w:rPr>
-        <w:br/>
-        <w:t>1.2.1 Описание предметной области</w:t>
-      </w:r>
-      <w:r>
-        <w:rPr>
-          <w:rFonts w:ascii="Times New Roman" w:hAnsi="Times New Roman" w:cs="Times New Roman"/>
-        </w:rPr>
-        <w:br/>
-        <w:t>1.2.2 Характеристика объекта и предмета исследования</w:t>
-      </w:r>
-      <w:r>
-        <w:rPr>
-          <w:rFonts w:ascii="Times New Roman" w:hAnsi="Times New Roman" w:cs="Times New Roman"/>
-        </w:rPr>
-        <w:br/>
-        <w:t>1.2.3 Постановка проблемы исследования</w:t>
-      </w:r>
-      <w:r>
-        <w:rPr>
-          <w:rFonts w:ascii="Times New Roman" w:hAnsi="Times New Roman" w:cs="Times New Roman"/>
-        </w:rPr>
-        <w:br/>
-        <w:t>1.2.4 Сравнительная характеристика существующих решений</w:t>
-      </w:r>
-      <w:r>
-        <w:rPr>
-          <w:rFonts w:ascii="Times New Roman" w:hAnsi="Times New Roman" w:cs="Times New Roman"/>
-        </w:rPr>
-        <w:br/>
-        <w:t>1.3 Алгоритмы решения поставленных задач и выявленных проблем</w:t>
-      </w:r>
-      <w:r>
-        <w:rPr>
-          <w:rFonts w:ascii="Times New Roman" w:hAnsi="Times New Roman" w:cs="Times New Roman"/>
-        </w:rPr>
-        <w:br/>
-        <w:t>1.4 Анализ возможностей автоматизации решения поставленных задач и выявленных проблем</w:t>
-      </w:r>
-      <w:r>
-        <w:rPr>
-          <w:rFonts w:ascii="Times New Roman" w:hAnsi="Times New Roman" w:cs="Times New Roman"/>
-        </w:rPr>
-        <w:br/>
-        <w:t xml:space="preserve">2 </w:t>
+        <w:t>2</w:t>
+      </w:r>
+      <w:r>
+        <w:rPr>
+          <w:rFonts w:ascii="Times New Roman" w:hAnsi="Times New Roman" w:cs="Times New Roman"/>
+        </w:rPr>
+        <w:t>.2 Анализ предметной области</w:t>
+      </w:r>
+      <w:r>
+        <w:rPr>
+          <w:rFonts w:ascii="Times New Roman" w:hAnsi="Times New Roman" w:cs="Times New Roman"/>
+        </w:rPr>
+        <w:br/>
+      </w:r>
+      <w:r>
+        <w:rPr>
+          <w:rFonts w:ascii="Times New Roman" w:hAnsi="Times New Roman" w:cs="Times New Roman"/>
+        </w:rPr>
+        <w:t>2</w:t>
+      </w:r>
+      <w:r>
+        <w:rPr>
+          <w:rFonts w:ascii="Times New Roman" w:hAnsi="Times New Roman" w:cs="Times New Roman"/>
+        </w:rPr>
+        <w:t>.2.1 Описание предметной области</w:t>
+      </w:r>
+      <w:r>
+        <w:rPr>
+          <w:rFonts w:ascii="Times New Roman" w:hAnsi="Times New Roman" w:cs="Times New Roman"/>
+        </w:rPr>
+        <w:br/>
+      </w:r>
+      <w:r>
+        <w:rPr>
+          <w:rFonts w:ascii="Times New Roman" w:hAnsi="Times New Roman" w:cs="Times New Roman"/>
+        </w:rPr>
+        <w:t>2</w:t>
+      </w:r>
+      <w:r>
+        <w:rPr>
+          <w:rFonts w:ascii="Times New Roman" w:hAnsi="Times New Roman" w:cs="Times New Roman"/>
+        </w:rPr>
+        <w:t>.2.2 Характеристика объекта и предмета исследования</w:t>
+      </w:r>
+      <w:r>
+        <w:rPr>
+          <w:rFonts w:ascii="Times New Roman" w:hAnsi="Times New Roman" w:cs="Times New Roman"/>
+        </w:rPr>
+        <w:br/>
+      </w:r>
+      <w:r>
+        <w:rPr>
+          <w:rFonts w:ascii="Times New Roman" w:hAnsi="Times New Roman" w:cs="Times New Roman"/>
+        </w:rPr>
+        <w:t>2</w:t>
+      </w:r>
+      <w:r>
+        <w:rPr>
+          <w:rFonts w:ascii="Times New Roman" w:hAnsi="Times New Roman" w:cs="Times New Roman"/>
+        </w:rPr>
+        <w:t>.2.3 Постановка проблемы исследования</w:t>
+      </w:r>
+      <w:r>
+        <w:rPr>
+          <w:rFonts w:ascii="Times New Roman" w:hAnsi="Times New Roman" w:cs="Times New Roman"/>
+        </w:rPr>
+        <w:br/>
+      </w:r>
+      <w:r>
+        <w:rPr>
+          <w:rFonts w:ascii="Times New Roman" w:hAnsi="Times New Roman" w:cs="Times New Roman"/>
+        </w:rPr>
+        <w:t>2</w:t>
+      </w:r>
+      <w:r>
+        <w:rPr>
+          <w:rFonts w:ascii="Times New Roman" w:hAnsi="Times New Roman" w:cs="Times New Roman"/>
+        </w:rPr>
+        <w:t>.2.4 Сравнительная характеристика существующих решений</w:t>
+      </w:r>
+      <w:r>
+        <w:rPr>
+          <w:rFonts w:ascii="Times New Roman" w:hAnsi="Times New Roman" w:cs="Times New Roman"/>
+        </w:rPr>
+        <w:br/>
+      </w:r>
+      <w:r>
+        <w:rPr>
+          <w:rFonts w:ascii="Times New Roman" w:hAnsi="Times New Roman" w:cs="Times New Roman"/>
+        </w:rPr>
+        <w:t>2</w:t>
+      </w:r>
+      <w:r>
+        <w:rPr>
+          <w:rFonts w:ascii="Times New Roman" w:hAnsi="Times New Roman" w:cs="Times New Roman"/>
+        </w:rPr>
+        <w:t>.3 Алгоритмы решения поставленных задач и выявленных проблем</w:t>
+      </w:r>
+      <w:r>
+        <w:rPr>
+          <w:rFonts w:ascii="Times New Roman" w:hAnsi="Times New Roman" w:cs="Times New Roman"/>
+        </w:rPr>
+        <w:br/>
+      </w:r>
+      <w:r>
+        <w:rPr>
+          <w:rFonts w:ascii="Times New Roman" w:hAnsi="Times New Roman" w:cs="Times New Roman"/>
+        </w:rPr>
+        <w:t>2</w:t>
+      </w:r>
+      <w:r>
+        <w:rPr>
+          <w:rFonts w:ascii="Times New Roman" w:hAnsi="Times New Roman" w:cs="Times New Roman"/>
+        </w:rPr>
+        <w:t>.4 Анализ возможностей автоматизации решения поставленных задач и выявленных проблем</w:t>
+      </w:r>
+      <w:r>
+        <w:rPr>
+          <w:rFonts w:ascii="Times New Roman" w:hAnsi="Times New Roman" w:cs="Times New Roman"/>
+        </w:rPr>
+        <w:br/>
+      </w:r>
+      <w:r>
+        <w:rPr>
+          <w:rFonts w:ascii="Times New Roman" w:hAnsi="Times New Roman" w:cs="Times New Roman"/>
+        </w:rPr>
+        <w:t>3</w:t>
+      </w:r>
+      <w:r>
+        <w:rPr>
+          <w:rFonts w:ascii="Times New Roman" w:hAnsi="Times New Roman" w:cs="Times New Roman"/>
+        </w:rPr>
+        <w:t xml:space="preserve"> </w:t>
       </w:r>
       <w:bookmarkStart w:id="0" w:name="_Hlk226228842"/>
       <w:r>
@@ -255,42 +317,108 @@
           <w:rFonts w:ascii="Times New Roman" w:hAnsi="Times New Roman" w:cs="Times New Roman"/>
         </w:rPr>
         <w:br/>
-        <w:t>2.1 Перечень задач и проблем для решения в процессе прохождения практики в [название организации]</w:t>
-      </w:r>
-      <w:r>
-        <w:rPr>
-          <w:rFonts w:ascii="Times New Roman" w:hAnsi="Times New Roman" w:cs="Times New Roman"/>
-        </w:rPr>
-        <w:br/>
-        <w:t>2.2 Алгоритмы решения поставленных задач и выявленных проблем в [название организации]</w:t>
-      </w:r>
-      <w:r>
-        <w:rPr>
-          <w:rFonts w:ascii="Times New Roman" w:hAnsi="Times New Roman" w:cs="Times New Roman"/>
-        </w:rPr>
-        <w:br/>
-        <w:t>2.3 Анализ возможностей автоматизации решения поставленных задач и выявленных проблем в [название организации]</w:t>
-      </w:r>
-      <w:r>
-        <w:rPr>
-          <w:rFonts w:ascii="Times New Roman" w:hAnsi="Times New Roman" w:cs="Times New Roman"/>
-        </w:rPr>
-        <w:br/>
-        <w:t>2.4 Процесс получения результатов</w:t>
-      </w:r>
-      <w:r>
-        <w:rPr>
-          <w:rFonts w:ascii="Times New Roman" w:hAnsi="Times New Roman" w:cs="Times New Roman"/>
-        </w:rPr>
-        <w:br/>
-        <w:t>2.4.1 Перечень созданных артефактов и осязаемых результатов работы</w:t>
-      </w:r>
-      <w:r>
-        <w:rPr>
-          <w:rFonts w:ascii="Times New Roman" w:hAnsi="Times New Roman" w:cs="Times New Roman"/>
-        </w:rPr>
-        <w:br/>
-        <w:t xml:space="preserve">2.4.2 [Определяется </w:t>
+      </w:r>
+      <w:r>
+        <w:rPr>
+          <w:rFonts w:ascii="Times New Roman" w:hAnsi="Times New Roman" w:cs="Times New Roman"/>
+        </w:rPr>
+        <w:t>3</w:t>
+      </w:r>
+      <w:r>
+        <w:rPr>
+          <w:rFonts w:ascii="Times New Roman" w:hAnsi="Times New Roman" w:cs="Times New Roman"/>
+        </w:rPr>
+        <w:t>.1 Перечень задач и проблем для решения в процессе прохождения практики в [название организации]</w:t>
+      </w:r>
+      <w:r>
+        <w:rPr>
+          <w:rFonts w:ascii="Times New Roman" w:hAnsi="Times New Roman" w:cs="Times New Roman"/>
+        </w:rPr>
+        <w:br/>
+      </w:r>
+      <w:r>
+        <w:rPr>
+          <w:rFonts w:ascii="Times New Roman" w:hAnsi="Times New Roman" w:cs="Times New Roman"/>
+        </w:rPr>
+        <w:t>3</w:t>
+      </w:r>
+      <w:r>
+        <w:rPr>
+          <w:rFonts w:ascii="Times New Roman" w:hAnsi="Times New Roman" w:cs="Times New Roman"/>
+        </w:rPr>
+        <w:t>.2 Алгоритмы решения поставленных задач и выявленных проблем в [название организации]</w:t>
+      </w:r>
+      <w:r>
+        <w:rPr>
+          <w:rFonts w:ascii="Times New Roman" w:hAnsi="Times New Roman" w:cs="Times New Roman"/>
+        </w:rPr>
+        <w:br/>
+      </w:r>
+      <w:r>
+        <w:rPr>
+          <w:rFonts w:ascii="Times New Roman" w:hAnsi="Times New Roman" w:cs="Times New Roman"/>
+        </w:rPr>
+        <w:t>3</w:t>
+      </w:r>
+      <w:r>
+        <w:rPr>
+          <w:rFonts w:ascii="Times New Roman" w:hAnsi="Times New Roman" w:cs="Times New Roman"/>
+        </w:rPr>
+        <w:t>.3 Анализ возможностей автоматизации решения поставленных задач и выявленных проблем в [название организации]</w:t>
+      </w:r>
+      <w:r>
+        <w:rPr>
+          <w:rFonts w:ascii="Times New Roman" w:hAnsi="Times New Roman" w:cs="Times New Roman"/>
+        </w:rPr>
+        <w:br/>
+      </w:r>
+      <w:r>
+        <w:rPr>
+          <w:rFonts w:ascii="Times New Roman" w:hAnsi="Times New Roman" w:cs="Times New Roman"/>
+        </w:rPr>
+        <w:t>3</w:t>
+      </w:r>
+      <w:r>
+        <w:rPr>
+          <w:rFonts w:ascii="Times New Roman" w:hAnsi="Times New Roman" w:cs="Times New Roman"/>
+        </w:rPr>
+        <w:t>.4 Процесс получения результатов</w:t>
+      </w:r>
+      <w:r>
+        <w:rPr>
+          <w:rFonts w:ascii="Times New Roman" w:hAnsi="Times New Roman" w:cs="Times New Roman"/>
+        </w:rPr>
+        <w:br/>
+      </w:r>
+      <w:r>
+        <w:rPr>
+          <w:rFonts w:ascii="Times New Roman" w:hAnsi="Times New Roman" w:cs="Times New Roman"/>
+        </w:rPr>
+        <w:t>3</w:t>
+      </w:r>
+      <w:r>
+        <w:rPr>
+          <w:rFonts w:ascii="Times New Roman" w:hAnsi="Times New Roman" w:cs="Times New Roman"/>
+        </w:rPr>
+        <w:t>.4.1 Перечень созданных артефактов и осязаемых результатов работы</w:t>
+      </w:r>
+      <w:r>
+        <w:rPr>
+          <w:rFonts w:ascii="Times New Roman" w:hAnsi="Times New Roman" w:cs="Times New Roman"/>
+        </w:rPr>
+        <w:br/>
+      </w:r>
+      <w:r>
+        <w:rPr>
+          <w:rFonts w:ascii="Times New Roman" w:hAnsi="Times New Roman" w:cs="Times New Roman"/>
+        </w:rPr>
+        <w:t>3</w:t>
+      </w:r>
+      <w:r>
+        <w:rPr>
+          <w:rFonts w:ascii="Times New Roman" w:hAnsi="Times New Roman" w:cs="Times New Roman"/>
+        </w:rPr>
+        <w:t xml:space="preserve">.4.2 [Определяется </w:t>
       </w:r>
       <w:proofErr w:type="spellStart"/>
       <w:r>
@@ -311,7 +439,18 @@
           <w:rFonts w:ascii="Times New Roman" w:hAnsi="Times New Roman" w:cs="Times New Roman"/>
         </w:rPr>
         <w:br/>
-        <w:t xml:space="preserve">2.4.3 [Определяется </w:t>
+      </w:r>
+      <w:r>
+        <w:rPr>
+          <w:rFonts w:ascii="Times New Roman" w:hAnsi="Times New Roman" w:cs="Times New Roman"/>
+        </w:rPr>
+        <w:t>3</w:t>
+      </w:r>
+      <w:r>
+        <w:rPr>
+          <w:rFonts w:ascii="Times New Roman" w:hAnsi="Times New Roman" w:cs="Times New Roman"/>
+        </w:rPr>
+        <w:t xml:space="preserve">.4.3 [Определяется </w:t>
       </w:r>
       <w:proofErr w:type="spellStart"/>
       <w:r>
@@ -397,6 +536,850 @@
         <w:br/>
         <w:t>ПРИЛОЖЕНИЯ</w:t>
       </w:r>
+    </w:p>
+    <w:p>
+      <w:pPr>
+        <w:rPr>
+          <w:rFonts w:ascii="Times New Roman" w:hAnsi="Times New Roman" w:cs="Times New Roman"/>
+        </w:rPr>
+      </w:pPr>
+    </w:p>
+    <w:p>
+      <w:pPr>
+        <w:pBdr>
+          <w:top w:val="none" w:sz="0" w:space="0" w:color="000000"/>
+          <w:left w:val="none" w:sz="0" w:space="0" w:color="000000"/>
+          <w:bottom w:val="none" w:sz="0" w:space="0" w:color="000000"/>
+          <w:right w:val="none" w:sz="0" w:space="0" w:color="000000"/>
+        </w:pBdr>
+        <w:rPr>
+          <w:rFonts w:ascii="Times New Roman" w:eastAsia="Courier New" w:hAnsi="Times New Roman" w:cs="Times New Roman"/>
+          <w:color w:val="000000"/>
+          <w:sz w:val="28"/>
+          <w:szCs w:val="28"/>
+        </w:rPr>
+      </w:pPr>
+      <w:r>
+        <w:rPr>
+          <w:rFonts w:ascii="Times New Roman" w:eastAsia="Courier New" w:hAnsi="Times New Roman" w:cs="Times New Roman"/>
+          <w:color w:val="000000"/>
+          <w:sz w:val="28"/>
+          <w:szCs w:val="28"/>
+        </w:rPr>
+        <w:lastRenderedPageBreak/>
+        <w:t>СОДЕРЖАНИЕ</w:t>
+      </w:r>
+    </w:p>
+    <w:p>
+      <w:pPr>
+        <w:pBdr>
+          <w:top w:val="none" w:sz="0" w:space="0" w:color="000000"/>
+          <w:left w:val="none" w:sz="0" w:space="0" w:color="000000"/>
+          <w:bottom w:val="none" w:sz="0" w:space="0" w:color="000000"/>
+          <w:right w:val="none" w:sz="0" w:space="0" w:color="000000"/>
+        </w:pBdr>
+        <w:rPr>
+          <w:rFonts w:ascii="Times New Roman" w:eastAsia="Courier New" w:hAnsi="Times New Roman" w:cs="Times New Roman"/>
+          <w:color w:val="000000"/>
+          <w:sz w:val="28"/>
+          <w:szCs w:val="28"/>
+        </w:rPr>
+      </w:pPr>
+      <w:r>
+        <w:rPr>
+          <w:rFonts w:ascii="Times New Roman" w:eastAsia="Courier New" w:hAnsi="Times New Roman" w:cs="Times New Roman"/>
+          <w:color w:val="000000"/>
+          <w:sz w:val="28"/>
+          <w:szCs w:val="28"/>
+        </w:rPr>
+        <w:t xml:space="preserve">Список используемых сокращений (если таковой требуется); </w:t>
+      </w:r>
+    </w:p>
+    <w:p>
+      <w:pPr>
+        <w:pBdr>
+          <w:top w:val="none" w:sz="0" w:space="0" w:color="000000"/>
+          <w:left w:val="none" w:sz="0" w:space="0" w:color="000000"/>
+          <w:bottom w:val="none" w:sz="0" w:space="0" w:color="000000"/>
+          <w:right w:val="none" w:sz="0" w:space="0" w:color="000000"/>
+        </w:pBdr>
+        <w:spacing w:after="0" w:line="360" w:lineRule="auto"/>
+        <w:rPr>
+          <w:rFonts w:ascii="Times New Roman" w:eastAsia="Courier New" w:hAnsi="Times New Roman" w:cs="Times New Roman"/>
+          <w:color w:val="000000"/>
+          <w:sz w:val="28"/>
+          <w:szCs w:val="28"/>
+        </w:rPr>
+      </w:pPr>
+      <w:r>
+        <w:rPr>
+          <w:rFonts w:ascii="Times New Roman" w:eastAsia="Courier New" w:hAnsi="Times New Roman" w:cs="Times New Roman"/>
+          <w:color w:val="000000"/>
+          <w:sz w:val="28"/>
+          <w:szCs w:val="28"/>
+        </w:rPr>
+        <w:t>ВВЕДЕНИЕ</w:t>
+      </w:r>
+    </w:p>
+    <w:p>
+      <w:pPr>
+        <w:pStyle w:val="a7"/>
+        <w:numPr>
+          <w:ilvl w:val="0"/>
+          <w:numId w:val="2"/>
+        </w:numPr>
+        <w:pBdr>
+          <w:top w:val="none" w:sz="0" w:space="0" w:color="000000"/>
+          <w:left w:val="none" w:sz="0" w:space="0" w:color="000000"/>
+          <w:bottom w:val="none" w:sz="0" w:space="0" w:color="000000"/>
+          <w:right w:val="none" w:sz="0" w:space="0" w:color="000000"/>
+        </w:pBdr>
+        <w:spacing w:after="0" w:line="360" w:lineRule="auto"/>
+        <w:rPr>
+          <w:rFonts w:ascii="Times New Roman" w:eastAsia="Courier New" w:hAnsi="Times New Roman" w:cs="Times New Roman"/>
+          <w:color w:val="000000"/>
+          <w:sz w:val="28"/>
+          <w:szCs w:val="28"/>
+        </w:rPr>
+      </w:pPr>
+      <w:r>
+        <w:rPr>
+          <w:rFonts w:ascii="Times New Roman" w:eastAsia="Courier New" w:hAnsi="Times New Roman" w:cs="Times New Roman"/>
+          <w:color w:val="000000"/>
+          <w:sz w:val="28"/>
+          <w:szCs w:val="28"/>
+        </w:rPr>
+        <w:t>ИССЛЕДОВАНИЕ ПО ТЕМЕ «СИСТЕМА МОНИТОРИНГА ТЕЛЕКОММУНИКАЦИОННОГО ОБОРУДОВАНИЯ»</w:t>
+      </w:r>
+    </w:p>
+    <w:p>
+      <w:pPr>
+        <w:pBdr>
+          <w:top w:val="none" w:sz="0" w:space="0" w:color="000000"/>
+          <w:left w:val="none" w:sz="0" w:space="0" w:color="000000"/>
+          <w:bottom w:val="none" w:sz="0" w:space="0" w:color="000000"/>
+          <w:right w:val="none" w:sz="0" w:space="0" w:color="000000"/>
+        </w:pBdr>
+        <w:spacing w:after="0" w:line="360" w:lineRule="auto"/>
+        <w:rPr>
+          <w:rFonts w:ascii="Times New Roman" w:hAnsi="Times New Roman" w:cs="Times New Roman"/>
+          <w:sz w:val="28"/>
+          <w:szCs w:val="28"/>
+        </w:rPr>
+      </w:pPr>
+      <w:r>
+        <w:rPr>
+          <w:rFonts w:ascii="Times New Roman" w:eastAsia="Courier New" w:hAnsi="Times New Roman" w:cs="Times New Roman"/>
+          <w:color w:val="000000"/>
+          <w:sz w:val="28"/>
+          <w:szCs w:val="28"/>
+        </w:rPr>
+        <w:t xml:space="preserve">1.1 </w:t>
+      </w:r>
+      <w:r>
+        <w:rPr>
+          <w:rFonts w:ascii="Times New Roman" w:eastAsia="Courier New" w:hAnsi="Times New Roman" w:cs="Times New Roman"/>
+          <w:color w:val="000000"/>
+          <w:sz w:val="28"/>
+          <w:szCs w:val="28"/>
+        </w:rPr>
+        <w:tab/>
+      </w:r>
+      <w:r>
+        <w:rPr>
+          <w:rFonts w:ascii="Times New Roman" w:eastAsia="Courier New" w:hAnsi="Times New Roman" w:cs="Times New Roman"/>
+          <w:color w:val="000000"/>
+          <w:sz w:val="28"/>
+          <w:szCs w:val="28"/>
+        </w:rPr>
+        <w:t> Литературный обзор по теме</w:t>
+      </w:r>
+      <w:r>
+        <w:rPr>
+          <w:rFonts w:ascii="Times New Roman" w:eastAsia="Courier New" w:hAnsi="Times New Roman" w:cs="Times New Roman"/>
+          <w:color w:val="000000"/>
+          <w:sz w:val="28"/>
+          <w:szCs w:val="28"/>
+        </w:rPr>
+        <w:t xml:space="preserve"> </w:t>
+      </w:r>
+      <w:r>
+        <w:rPr>
+          <w:rFonts w:ascii="Times New Roman" w:eastAsia="Courier New" w:hAnsi="Times New Roman" w:cs="Times New Roman"/>
+          <w:color w:val="000000"/>
+          <w:sz w:val="28"/>
+          <w:szCs w:val="28"/>
+        </w:rPr>
+        <w:t xml:space="preserve">«Система </w:t>
+      </w:r>
+      <w:r>
+        <w:rPr>
+          <w:rFonts w:ascii="Times New Roman" w:eastAsia="Courier New" w:hAnsi="Times New Roman" w:cs="Times New Roman"/>
+          <w:color w:val="000000"/>
+          <w:sz w:val="28"/>
+          <w:szCs w:val="28"/>
+        </w:rPr>
+        <w:t>мониторинга телекоммуникационного оборудования</w:t>
+      </w:r>
+      <w:r>
+        <w:rPr>
+          <w:rFonts w:ascii="Times New Roman" w:eastAsia="Courier New" w:hAnsi="Times New Roman" w:cs="Times New Roman"/>
+          <w:color w:val="000000"/>
+          <w:sz w:val="28"/>
+          <w:szCs w:val="28"/>
+        </w:rPr>
+        <w:t>»</w:t>
+      </w:r>
+    </w:p>
+    <w:p>
+      <w:pPr>
+        <w:pBdr>
+          <w:top w:val="none" w:sz="0" w:space="0" w:color="000000"/>
+          <w:left w:val="none" w:sz="0" w:space="0" w:color="000000"/>
+          <w:bottom w:val="none" w:sz="0" w:space="0" w:color="000000"/>
+          <w:right w:val="none" w:sz="0" w:space="0" w:color="000000"/>
+        </w:pBdr>
+        <w:spacing w:after="0" w:line="360" w:lineRule="auto"/>
+        <w:jc w:val="both"/>
+        <w:rPr>
+          <w:rFonts w:ascii="Times New Roman" w:eastAsia="Courier New" w:hAnsi="Times New Roman" w:cs="Times New Roman"/>
+          <w:color w:val="000000"/>
+          <w:sz w:val="28"/>
+          <w:szCs w:val="28"/>
+        </w:rPr>
+      </w:pPr>
+      <w:r>
+        <w:rPr>
+          <w:rFonts w:ascii="Times New Roman" w:eastAsia="Courier New" w:hAnsi="Times New Roman" w:cs="Times New Roman"/>
+          <w:color w:val="000000"/>
+          <w:sz w:val="28"/>
+          <w:szCs w:val="28"/>
+        </w:rPr>
+        <w:t>1.1.1</w:t>
+      </w:r>
+      <w:r>
+        <w:rPr>
+          <w:rFonts w:ascii="Times New Roman" w:eastAsia="Courier New" w:hAnsi="Times New Roman" w:cs="Times New Roman"/>
+          <w:color w:val="000000"/>
+          <w:sz w:val="28"/>
+          <w:szCs w:val="28"/>
+        </w:rPr>
+        <w:tab/>
+        <w:t xml:space="preserve">Исторический анализ процессов построения систем мониторинга. </w:t>
+      </w:r>
+    </w:p>
+    <w:p>
+      <w:pPr>
+        <w:pBdr>
+          <w:top w:val="none" w:sz="0" w:space="0" w:color="000000"/>
+          <w:left w:val="none" w:sz="0" w:space="0" w:color="000000"/>
+          <w:bottom w:val="none" w:sz="0" w:space="0" w:color="000000"/>
+          <w:right w:val="none" w:sz="0" w:space="0" w:color="000000"/>
+        </w:pBdr>
+        <w:spacing w:after="25" w:line="360" w:lineRule="auto"/>
+        <w:rPr>
+          <w:rFonts w:ascii="Times New Roman" w:eastAsia="Courier New" w:hAnsi="Times New Roman" w:cs="Times New Roman"/>
+          <w:color w:val="000000"/>
+          <w:sz w:val="28"/>
+          <w:szCs w:val="28"/>
+        </w:rPr>
+      </w:pPr>
+      <w:r>
+        <w:rPr>
+          <w:rFonts w:ascii="Times New Roman" w:eastAsia="Courier New" w:hAnsi="Times New Roman" w:cs="Times New Roman"/>
+          <w:color w:val="000000"/>
+          <w:sz w:val="28"/>
+          <w:szCs w:val="28"/>
+        </w:rPr>
+        <w:t>1.2.1</w:t>
+      </w:r>
+      <w:r>
+        <w:rPr>
+          <w:rFonts w:ascii="Times New Roman" w:eastAsia="Courier New" w:hAnsi="Times New Roman" w:cs="Times New Roman"/>
+          <w:color w:val="000000"/>
+          <w:sz w:val="28"/>
+          <w:szCs w:val="28"/>
+        </w:rPr>
+        <w:tab/>
+        <w:t>Структура и</w:t>
+      </w:r>
+      <w:r>
+        <w:rPr>
+          <w:rFonts w:ascii="Times New Roman" w:hAnsi="Times New Roman" w:cs="Times New Roman"/>
+        </w:rPr>
+        <w:t xml:space="preserve"> </w:t>
+      </w:r>
+      <w:r>
+        <w:rPr>
+          <w:rFonts w:ascii="Times New Roman" w:eastAsia="Courier New" w:hAnsi="Times New Roman" w:cs="Times New Roman"/>
+          <w:color w:val="000000"/>
+          <w:sz w:val="28"/>
+          <w:szCs w:val="28"/>
+        </w:rPr>
+        <w:t>классификация сетевых систем.</w:t>
+      </w:r>
+    </w:p>
+    <w:p>
+      <w:pPr>
+        <w:pBdr>
+          <w:top w:val="none" w:sz="0" w:space="0" w:color="000000"/>
+          <w:left w:val="none" w:sz="0" w:space="0" w:color="000000"/>
+          <w:bottom w:val="none" w:sz="0" w:space="0" w:color="000000"/>
+          <w:right w:val="none" w:sz="0" w:space="0" w:color="000000"/>
+        </w:pBdr>
+        <w:spacing w:after="0" w:line="360" w:lineRule="auto"/>
+        <w:rPr>
+          <w:rFonts w:ascii="Times New Roman" w:eastAsia="Courier New" w:hAnsi="Times New Roman" w:cs="Times New Roman"/>
+          <w:color w:val="000000"/>
+          <w:sz w:val="28"/>
+          <w:szCs w:val="28"/>
+        </w:rPr>
+      </w:pPr>
+      <w:r>
+        <w:rPr>
+          <w:rFonts w:ascii="Times New Roman" w:eastAsia="Courier New" w:hAnsi="Times New Roman" w:cs="Times New Roman"/>
+          <w:color w:val="000000"/>
+          <w:sz w:val="28"/>
+          <w:szCs w:val="28"/>
+        </w:rPr>
+        <w:t>1.2.2</w:t>
+      </w:r>
+      <w:r>
+        <w:rPr>
+          <w:rFonts w:ascii="Times New Roman" w:eastAsia="Courier New" w:hAnsi="Times New Roman" w:cs="Times New Roman"/>
+          <w:color w:val="000000"/>
+          <w:sz w:val="28"/>
+          <w:szCs w:val="28"/>
+        </w:rPr>
+        <w:tab/>
+        <w:t xml:space="preserve">Первый уровень - персональные сети. </w:t>
+      </w:r>
+    </w:p>
+    <w:p>
+      <w:pPr>
+        <w:pBdr>
+          <w:top w:val="none" w:sz="0" w:space="0" w:color="000000"/>
+          <w:left w:val="none" w:sz="0" w:space="0" w:color="000000"/>
+          <w:bottom w:val="none" w:sz="0" w:space="0" w:color="000000"/>
+          <w:right w:val="none" w:sz="0" w:space="0" w:color="000000"/>
+        </w:pBdr>
+        <w:spacing w:after="0" w:line="360" w:lineRule="auto"/>
+        <w:jc w:val="both"/>
+        <w:rPr>
+          <w:rFonts w:ascii="Times New Roman" w:eastAsia="Courier New" w:hAnsi="Times New Roman" w:cs="Times New Roman"/>
+          <w:color w:val="000000"/>
+          <w:sz w:val="28"/>
+          <w:szCs w:val="28"/>
+        </w:rPr>
+      </w:pPr>
+      <w:r>
+        <w:rPr>
+          <w:rFonts w:ascii="Times New Roman" w:eastAsia="Courier New" w:hAnsi="Times New Roman" w:cs="Times New Roman"/>
+          <w:color w:val="000000"/>
+          <w:sz w:val="28"/>
+          <w:szCs w:val="28"/>
+        </w:rPr>
+        <w:t>1.2.3</w:t>
+      </w:r>
+      <w:r>
+        <w:rPr>
+          <w:rFonts w:ascii="Times New Roman" w:eastAsia="Courier New" w:hAnsi="Times New Roman" w:cs="Times New Roman"/>
+          <w:color w:val="000000"/>
+          <w:sz w:val="28"/>
+          <w:szCs w:val="28"/>
+        </w:rPr>
+        <w:tab/>
+        <w:t>Локальные сети второго уровня.</w:t>
+      </w:r>
+    </w:p>
+    <w:p>
+      <w:pPr>
+        <w:pBdr>
+          <w:top w:val="none" w:sz="0" w:space="0" w:color="000000"/>
+          <w:left w:val="none" w:sz="0" w:space="0" w:color="000000"/>
+          <w:bottom w:val="none" w:sz="0" w:space="0" w:color="000000"/>
+          <w:right w:val="none" w:sz="0" w:space="0" w:color="000000"/>
+        </w:pBdr>
+        <w:spacing w:after="0" w:line="360" w:lineRule="auto"/>
+        <w:rPr>
+          <w:rFonts w:ascii="Times New Roman" w:eastAsia="Courier New" w:hAnsi="Times New Roman" w:cs="Times New Roman"/>
+          <w:color w:val="000000"/>
+          <w:sz w:val="28"/>
+          <w:szCs w:val="28"/>
+        </w:rPr>
+      </w:pPr>
+      <w:r>
+        <w:rPr>
+          <w:rFonts w:ascii="Times New Roman" w:eastAsia="Courier New" w:hAnsi="Times New Roman" w:cs="Times New Roman"/>
+          <w:color w:val="000000"/>
+          <w:sz w:val="28"/>
+          <w:szCs w:val="28"/>
+        </w:rPr>
+        <w:t>1.2.4</w:t>
+      </w:r>
+      <w:r>
+        <w:rPr>
+          <w:rFonts w:ascii="Times New Roman" w:eastAsia="Courier New" w:hAnsi="Times New Roman" w:cs="Times New Roman"/>
+          <w:color w:val="000000"/>
+          <w:sz w:val="28"/>
+          <w:szCs w:val="28"/>
+        </w:rPr>
+        <w:tab/>
+        <w:t xml:space="preserve">Городские вычислительные сети третьего уровня. </w:t>
+      </w:r>
+    </w:p>
+    <w:p>
+      <w:pPr>
+        <w:pBdr>
+          <w:top w:val="none" w:sz="0" w:space="0" w:color="000000"/>
+          <w:left w:val="none" w:sz="0" w:space="0" w:color="000000"/>
+          <w:bottom w:val="none" w:sz="0" w:space="0" w:color="000000"/>
+          <w:right w:val="none" w:sz="0" w:space="0" w:color="000000"/>
+        </w:pBdr>
+        <w:spacing w:after="0" w:line="360" w:lineRule="auto"/>
+        <w:jc w:val="both"/>
+        <w:rPr>
+          <w:rFonts w:ascii="Times New Roman" w:hAnsi="Times New Roman" w:cs="Times New Roman"/>
+          <w:sz w:val="28"/>
+          <w:szCs w:val="28"/>
+        </w:rPr>
+      </w:pPr>
+      <w:r>
+        <w:rPr>
+          <w:rFonts w:ascii="Times New Roman" w:hAnsi="Times New Roman" w:cs="Times New Roman"/>
+          <w:sz w:val="28"/>
+          <w:szCs w:val="28"/>
+        </w:rPr>
+        <w:t>1.3.1</w:t>
+      </w:r>
+      <w:r>
+        <w:rPr>
+          <w:rFonts w:ascii="Times New Roman" w:hAnsi="Times New Roman" w:cs="Times New Roman"/>
+          <w:sz w:val="28"/>
+          <w:szCs w:val="28"/>
+        </w:rPr>
+        <w:tab/>
+        <w:t>Теория и методы мониторинга, диагностики и учета телекоммуникационного оборудования.</w:t>
+      </w:r>
+    </w:p>
+    <w:p>
+      <w:pPr>
+        <w:pBdr>
+          <w:top w:val="none" w:sz="0" w:space="0" w:color="000000"/>
+          <w:left w:val="none" w:sz="0" w:space="0" w:color="000000"/>
+          <w:bottom w:val="none" w:sz="0" w:space="0" w:color="000000"/>
+          <w:right w:val="none" w:sz="0" w:space="0" w:color="000000"/>
+        </w:pBdr>
+        <w:spacing w:after="0" w:line="360" w:lineRule="auto"/>
+        <w:jc w:val="both"/>
+        <w:rPr>
+          <w:rFonts w:ascii="Times New Roman" w:hAnsi="Times New Roman" w:cs="Times New Roman"/>
+          <w:sz w:val="28"/>
+          <w:szCs w:val="28"/>
+        </w:rPr>
+      </w:pPr>
+      <w:r>
+        <w:rPr>
+          <w:rFonts w:ascii="Times New Roman" w:hAnsi="Times New Roman" w:cs="Times New Roman"/>
+          <w:sz w:val="28"/>
+          <w:szCs w:val="28"/>
+        </w:rPr>
+        <w:t>1.3.2</w:t>
+      </w:r>
+      <w:r>
+        <w:rPr>
+          <w:rFonts w:ascii="Times New Roman" w:hAnsi="Times New Roman" w:cs="Times New Roman"/>
+          <w:sz w:val="28"/>
+          <w:szCs w:val="28"/>
+        </w:rPr>
+        <w:tab/>
+      </w:r>
+      <w:r>
+        <w:rPr>
+          <w:rFonts w:ascii="Times New Roman" w:hAnsi="Times New Roman" w:cs="Times New Roman"/>
+          <w:sz w:val="28"/>
+          <w:szCs w:val="28"/>
+        </w:rPr>
+        <w:t xml:space="preserve">Виды технического состояния </w:t>
+      </w:r>
+      <w:r>
+        <w:rPr>
+          <w:rFonts w:ascii="Times New Roman" w:hAnsi="Times New Roman" w:cs="Times New Roman"/>
+          <w:sz w:val="28"/>
+          <w:szCs w:val="28"/>
+        </w:rPr>
+        <w:t>и х</w:t>
+      </w:r>
+      <w:r>
+        <w:rPr>
+          <w:rFonts w:ascii="Times New Roman" w:hAnsi="Times New Roman" w:cs="Times New Roman"/>
+          <w:sz w:val="28"/>
+          <w:szCs w:val="28"/>
+        </w:rPr>
+        <w:t>арактеристики надежности систем</w:t>
+      </w:r>
+      <w:r>
+        <w:rPr>
+          <w:rFonts w:ascii="Times New Roman" w:hAnsi="Times New Roman" w:cs="Times New Roman"/>
+          <w:sz w:val="28"/>
+          <w:szCs w:val="28"/>
+        </w:rPr>
+        <w:t>.</w:t>
+      </w:r>
+    </w:p>
+    <w:p>
+      <w:pPr>
+        <w:pBdr>
+          <w:top w:val="none" w:sz="0" w:space="0" w:color="000000"/>
+          <w:left w:val="none" w:sz="0" w:space="0" w:color="000000"/>
+          <w:bottom w:val="none" w:sz="0" w:space="0" w:color="000000"/>
+          <w:right w:val="none" w:sz="0" w:space="0" w:color="000000"/>
+        </w:pBdr>
+        <w:spacing w:after="0" w:line="360" w:lineRule="auto"/>
+        <w:jc w:val="both"/>
+        <w:rPr>
+          <w:rFonts w:ascii="Times New Roman" w:hAnsi="Times New Roman" w:cs="Times New Roman"/>
+          <w:sz w:val="28"/>
+          <w:szCs w:val="28"/>
+        </w:rPr>
+      </w:pPr>
+      <w:r>
+        <w:rPr>
+          <w:rFonts w:ascii="Times New Roman" w:hAnsi="Times New Roman" w:cs="Times New Roman"/>
+          <w:sz w:val="28"/>
+          <w:szCs w:val="28"/>
+        </w:rPr>
+        <w:t>1.</w:t>
+      </w:r>
+      <w:r>
+        <w:rPr>
+          <w:rFonts w:ascii="Times New Roman" w:hAnsi="Times New Roman" w:cs="Times New Roman"/>
+          <w:sz w:val="28"/>
+          <w:szCs w:val="28"/>
+        </w:rPr>
+        <w:t>4</w:t>
+      </w:r>
+      <w:r>
+        <w:rPr>
+          <w:rFonts w:ascii="Times New Roman" w:hAnsi="Times New Roman" w:cs="Times New Roman"/>
+          <w:sz w:val="28"/>
+          <w:szCs w:val="28"/>
+        </w:rPr>
+        <w:t>.1</w:t>
+      </w:r>
+      <w:r>
+        <w:rPr>
+          <w:rFonts w:ascii="Times New Roman" w:hAnsi="Times New Roman" w:cs="Times New Roman"/>
+          <w:sz w:val="28"/>
+          <w:szCs w:val="28"/>
+        </w:rPr>
+        <w:tab/>
+      </w:r>
+      <w:r>
+        <w:rPr>
+          <w:rFonts w:ascii="Times New Roman" w:hAnsi="Times New Roman" w:cs="Times New Roman"/>
+          <w:sz w:val="28"/>
+          <w:szCs w:val="28"/>
+        </w:rPr>
+        <w:t>ПОДХОДЫ К МОНИТОРИНГУ СЕТЕВОЙ ИНФРАСТРУКТУРЫ</w:t>
+      </w:r>
+      <w:r>
+        <w:rPr>
+          <w:rFonts w:ascii="Times New Roman" w:hAnsi="Times New Roman" w:cs="Times New Roman"/>
+          <w:sz w:val="28"/>
+          <w:szCs w:val="28"/>
+        </w:rPr>
+        <w:t>.</w:t>
+      </w:r>
+    </w:p>
+    <w:p>
+      <w:pPr>
+        <w:pBdr>
+          <w:top w:val="none" w:sz="0" w:space="0" w:color="000000"/>
+          <w:left w:val="none" w:sz="0" w:space="0" w:color="000000"/>
+          <w:bottom w:val="none" w:sz="0" w:space="0" w:color="000000"/>
+          <w:right w:val="none" w:sz="0" w:space="0" w:color="000000"/>
+        </w:pBdr>
+        <w:spacing w:after="0" w:line="360" w:lineRule="auto"/>
+        <w:jc w:val="both"/>
+        <w:rPr>
+          <w:rFonts w:ascii="Times New Roman" w:hAnsi="Times New Roman" w:cs="Times New Roman"/>
+          <w:sz w:val="28"/>
+          <w:szCs w:val="28"/>
+        </w:rPr>
+      </w:pPr>
+      <w:r>
+        <w:rPr>
+          <w:rFonts w:ascii="Times New Roman" w:hAnsi="Times New Roman" w:cs="Times New Roman"/>
+          <w:sz w:val="28"/>
+          <w:szCs w:val="28"/>
+        </w:rPr>
+        <w:t>1.</w:t>
+      </w:r>
+      <w:r>
+        <w:rPr>
+          <w:rFonts w:ascii="Times New Roman" w:hAnsi="Times New Roman" w:cs="Times New Roman"/>
+          <w:sz w:val="28"/>
+          <w:szCs w:val="28"/>
+        </w:rPr>
+        <w:t>4</w:t>
+      </w:r>
+      <w:r>
+        <w:rPr>
+          <w:rFonts w:ascii="Times New Roman" w:hAnsi="Times New Roman" w:cs="Times New Roman"/>
+          <w:sz w:val="28"/>
+          <w:szCs w:val="28"/>
+        </w:rPr>
+        <w:t>.</w:t>
+      </w:r>
+      <w:r>
+        <w:rPr>
+          <w:rFonts w:ascii="Times New Roman" w:hAnsi="Times New Roman" w:cs="Times New Roman"/>
+          <w:sz w:val="28"/>
+          <w:szCs w:val="28"/>
+        </w:rPr>
+        <w:t>2</w:t>
+      </w:r>
+      <w:r>
+        <w:rPr>
+          <w:rFonts w:ascii="Times New Roman" w:hAnsi="Times New Roman" w:cs="Times New Roman"/>
+          <w:sz w:val="28"/>
+          <w:szCs w:val="28"/>
+        </w:rPr>
+        <w:t>.</w:t>
+      </w:r>
+      <w:r>
+        <w:rPr>
+          <w:rFonts w:ascii="Times New Roman" w:hAnsi="Times New Roman" w:cs="Times New Roman"/>
+          <w:sz w:val="28"/>
+          <w:szCs w:val="28"/>
+        </w:rPr>
+        <w:tab/>
+      </w:r>
+      <w:r>
+        <w:rPr>
+          <w:rFonts w:ascii="Times New Roman" w:hAnsi="Times New Roman" w:cs="Times New Roman"/>
+          <w:sz w:val="28"/>
+          <w:szCs w:val="28"/>
+        </w:rPr>
+        <w:t>Модель</w:t>
+      </w:r>
+      <w:r>
+        <w:rPr>
+          <w:rFonts w:ascii="Times New Roman" w:hAnsi="Times New Roman" w:cs="Times New Roman"/>
+          <w:sz w:val="28"/>
+          <w:szCs w:val="28"/>
+        </w:rPr>
+        <w:t xml:space="preserve"> </w:t>
+      </w:r>
+      <w:r>
+        <w:rPr>
+          <w:rFonts w:ascii="Times New Roman" w:hAnsi="Times New Roman" w:cs="Times New Roman"/>
+          <w:sz w:val="28"/>
+          <w:szCs w:val="28"/>
+          <w:lang w:val="en-US"/>
+        </w:rPr>
+        <w:t>OSI</w:t>
+      </w:r>
+      <w:r>
+        <w:rPr>
+          <w:rFonts w:ascii="Times New Roman" w:hAnsi="Times New Roman" w:cs="Times New Roman"/>
+          <w:sz w:val="28"/>
+          <w:szCs w:val="28"/>
+        </w:rPr>
+        <w:t xml:space="preserve"> </w:t>
+      </w:r>
+      <w:r>
+        <w:rPr>
+          <w:rFonts w:ascii="Times New Roman" w:hAnsi="Times New Roman" w:cs="Times New Roman"/>
+          <w:sz w:val="28"/>
+          <w:szCs w:val="28"/>
+        </w:rPr>
+        <w:t>и</w:t>
+      </w:r>
+      <w:r>
+        <w:rPr>
+          <w:rFonts w:ascii="Times New Roman" w:hAnsi="Times New Roman" w:cs="Times New Roman"/>
+          <w:sz w:val="28"/>
+          <w:szCs w:val="28"/>
+        </w:rPr>
+        <w:t xml:space="preserve"> </w:t>
+      </w:r>
+      <w:r>
+        <w:rPr>
+          <w:rFonts w:ascii="Times New Roman" w:hAnsi="Times New Roman" w:cs="Times New Roman"/>
+          <w:sz w:val="28"/>
+          <w:szCs w:val="28"/>
+          <w:lang w:val="en-US"/>
+        </w:rPr>
+        <w:t>TCP</w:t>
+      </w:r>
+      <w:r>
+        <w:rPr>
+          <w:rFonts w:ascii="Times New Roman" w:hAnsi="Times New Roman" w:cs="Times New Roman"/>
+          <w:sz w:val="28"/>
+          <w:szCs w:val="28"/>
+        </w:rPr>
+        <w:t>/</w:t>
+      </w:r>
+      <w:r>
+        <w:rPr>
+          <w:rFonts w:ascii="Times New Roman" w:hAnsi="Times New Roman" w:cs="Times New Roman"/>
+          <w:sz w:val="28"/>
+          <w:szCs w:val="28"/>
+          <w:lang w:val="en-US"/>
+        </w:rPr>
+        <w:t>IP</w:t>
+      </w:r>
+      <w:r>
+        <w:rPr>
+          <w:rFonts w:ascii="Times New Roman" w:hAnsi="Times New Roman" w:cs="Times New Roman"/>
+          <w:sz w:val="28"/>
+          <w:szCs w:val="28"/>
+        </w:rPr>
+        <w:t>.</w:t>
+      </w:r>
+    </w:p>
+    <w:p>
+      <w:pPr>
+        <w:spacing w:after="0" w:line="360" w:lineRule="auto"/>
+        <w:jc w:val="both"/>
+        <w:rPr>
+          <w:rFonts w:ascii="Times New Roman" w:hAnsi="Times New Roman" w:cs="Times New Roman"/>
+          <w:sz w:val="28"/>
+          <w:szCs w:val="28"/>
+        </w:rPr>
+      </w:pPr>
+      <w:r>
+        <w:rPr>
+          <w:rFonts w:ascii="Times New Roman" w:hAnsi="Times New Roman" w:cs="Times New Roman"/>
+          <w:sz w:val="28"/>
+          <w:szCs w:val="28"/>
+        </w:rPr>
+        <w:t>1.</w:t>
+      </w:r>
+      <w:r>
+        <w:rPr>
+          <w:rFonts w:ascii="Times New Roman" w:hAnsi="Times New Roman" w:cs="Times New Roman"/>
+          <w:sz w:val="28"/>
+          <w:szCs w:val="28"/>
+        </w:rPr>
+        <w:t>4</w:t>
+      </w:r>
+      <w:r>
+        <w:rPr>
+          <w:rFonts w:ascii="Times New Roman" w:hAnsi="Times New Roman" w:cs="Times New Roman"/>
+          <w:sz w:val="28"/>
+          <w:szCs w:val="28"/>
+        </w:rPr>
+        <w:t>.3</w:t>
+      </w:r>
+      <w:r>
+        <w:rPr>
+          <w:rFonts w:ascii="Times New Roman" w:hAnsi="Times New Roman" w:cs="Times New Roman"/>
+          <w:sz w:val="28"/>
+          <w:szCs w:val="28"/>
+        </w:rPr>
+        <w:tab/>
+      </w:r>
+      <w:r>
+        <w:rPr>
+          <w:rFonts w:ascii="Times New Roman" w:hAnsi="Times New Roman" w:cs="Times New Roman"/>
+          <w:sz w:val="28"/>
+          <w:szCs w:val="28"/>
+        </w:rPr>
+        <w:t>Протоколы телеметрии и методы сбора данных</w:t>
+      </w:r>
+    </w:p>
+    <w:p>
+      <w:pPr>
+        <w:pBdr>
+          <w:top w:val="none" w:sz="0" w:space="0" w:color="000000"/>
+          <w:left w:val="none" w:sz="0" w:space="0" w:color="000000"/>
+          <w:bottom w:val="none" w:sz="0" w:space="0" w:color="000000"/>
+          <w:right w:val="none" w:sz="0" w:space="0" w:color="000000"/>
+        </w:pBdr>
+        <w:spacing w:after="0" w:line="360" w:lineRule="auto"/>
+        <w:jc w:val="both"/>
+        <w:rPr>
+          <w:rFonts w:ascii="Times New Roman" w:hAnsi="Times New Roman" w:cs="Times New Roman"/>
+          <w:sz w:val="28"/>
+          <w:szCs w:val="28"/>
+        </w:rPr>
+      </w:pPr>
+      <w:r>
+        <w:rPr>
+          <w:rFonts w:ascii="Times New Roman" w:hAnsi="Times New Roman" w:cs="Times New Roman"/>
+          <w:sz w:val="28"/>
+          <w:szCs w:val="28"/>
+        </w:rPr>
+        <w:t>1.</w:t>
+      </w:r>
+      <w:r>
+        <w:rPr>
+          <w:rFonts w:ascii="Times New Roman" w:hAnsi="Times New Roman" w:cs="Times New Roman"/>
+          <w:sz w:val="28"/>
+          <w:szCs w:val="28"/>
+        </w:rPr>
+        <w:t>5</w:t>
+      </w:r>
+      <w:r>
+        <w:rPr>
+          <w:rFonts w:ascii="Times New Roman" w:hAnsi="Times New Roman" w:cs="Times New Roman"/>
+          <w:sz w:val="28"/>
+          <w:szCs w:val="28"/>
+        </w:rPr>
+        <w:t>. Системы мониторинга</w:t>
+      </w:r>
+      <w:r>
+        <w:rPr>
+          <w:rFonts w:ascii="Times New Roman" w:hAnsi="Times New Roman" w:cs="Times New Roman"/>
+          <w:sz w:val="28"/>
+          <w:szCs w:val="28"/>
+        </w:rPr>
+        <w:t xml:space="preserve"> ИТ-инфраструктуры</w:t>
+      </w:r>
+      <w:r>
+        <w:rPr>
+          <w:rFonts w:ascii="Times New Roman" w:hAnsi="Times New Roman" w:cs="Times New Roman"/>
+          <w:sz w:val="28"/>
+          <w:szCs w:val="28"/>
+        </w:rPr>
+        <w:t>: классификация и критерии выбора</w:t>
+      </w:r>
+      <w:r>
+        <w:rPr>
+          <w:rFonts w:ascii="Times New Roman" w:hAnsi="Times New Roman" w:cs="Times New Roman"/>
+          <w:sz w:val="28"/>
+          <w:szCs w:val="28"/>
+        </w:rPr>
+        <w:t>.</w:t>
+      </w:r>
+    </w:p>
+    <w:p>
+      <w:pPr>
+        <w:pBdr>
+          <w:top w:val="none" w:sz="0" w:space="0" w:color="000000"/>
+          <w:left w:val="none" w:sz="0" w:space="0" w:color="000000"/>
+          <w:bottom w:val="none" w:sz="0" w:space="0" w:color="000000"/>
+          <w:right w:val="none" w:sz="0" w:space="0" w:color="000000"/>
+        </w:pBdr>
+        <w:rPr>
+          <w:rFonts w:ascii="Times New Roman" w:eastAsia="Courier New" w:hAnsi="Times New Roman" w:cs="Times New Roman"/>
+          <w:b/>
+          <w:bCs/>
+          <w:color w:val="000000"/>
+          <w:sz w:val="22"/>
+          <w:szCs w:val="22"/>
+        </w:rPr>
+      </w:pPr>
+    </w:p>
+    <w:p>
+      <w:pPr>
+        <w:rPr>
+          <w:rFonts w:ascii="Times New Roman" w:hAnsi="Times New Roman" w:cs="Times New Roman"/>
+        </w:rPr>
+      </w:pPr>
     </w:p>
     <w:sectPr>
       <w:pgSz w:w="11906" w:h="16838"/>
@@ -406,6 +1389,192 @@
     </w:sectPr>
   </w:body>
 </w:document>
+</file>
+
+<file path=word/numbering.xml><?xml version="1.0" encoding="utf-8"?>
+<w:numbering xmlns:wpc="http://schemas.microsoft.com/office/word/2010/wordprocessingCanvas" xmlns:cx="http://schemas.microsoft.com/office/drawing/2014/chartex" xmlns:cx1="http://schemas.microsoft.com/office/drawing/2015/9/8/chartex" xmlns:cx2="http://schemas.microsoft.com/office/drawing/2015/10/21/chartex" xmlns:cx3="http://schemas.microsoft.com/office/drawing/2016/5/9/chartex" xmlns:cx4="http://schemas.microsoft.com/office/drawing/2016/5/10/chartex" xmlns:cx5="http://schemas.microsoft.com/office/drawing/2016/5/11/chartex" xmlns:cx6="http://schemas.microsoft.com/office/drawing/2016/5/12/chartex" xmlns:cx7="http://schemas.microsoft.com/office/drawing/2016/5/13/chartex" xmlns:cx8="http://schemas.microsoft.com/office/drawing/2016/5/14/chartex" xmlns:mc="http://schemas.openxmlformats.org/markup-compatibility/2006" xmlns:aink="http://schemas.microsoft.com/office/drawing/2016/ink" xmlns:am3d="http://schemas.microsoft.com/office/drawing/2017/model3d" xmlns:o="urn:schemas-microsoft-com:office:office" xmlns:oel="http://schemas.microsoft.com/office/2019/extlst" xmlns:r="http://schemas.openxmlformats.org/officeDocument/2006/relationships" xmlns:m="http://schemas.openxmlformats.org/officeDocument/2006/math" xmlns:v="urn:schemas-microsoft-com:vml" xmlns:wp14="http://schemas.microsoft.com/office/word/2010/wordprocessingDrawing" xmlns:wp="http://schemas.openxmlformats.org/drawingml/2006/wordprocessingDrawing" xmlns:w10="urn:schemas-microsoft-com:office:word" xmlns:w="http://schemas.openxmlformats.org/wordprocessingml/2006/main" xmlns:w14="http://schemas.microsoft.com/office/word/2010/wordml" xmlns:w15="http://schemas.microsoft.com/office/word/2012/wordml" xmlns:w16cex="http://schemas.microsoft.com/office/word/2018/wordml/cex" xmlns:w16cid="http://schemas.microsoft.com/office/word/2016/wordml/cid" xmlns:w16="http://schemas.microsoft.com/office/word/2018/wordml" xmlns:w16du="http://schemas.microsoft.com/office/word/2023/wordml/word16du" xmlns:w16sdtdh="http://schemas.microsoft.com/office/word/2020/wordml/sdtdatahash" xmlns:w16se="http://schemas.microsoft.com/office/word/2015/wordml/symex" xmlns:wpg="http://schemas.microsoft.com/office/word/2010/wordprocessingGroup" xmlns:wpi="http://schemas.microsoft.com/office/word/2010/wordprocessingInk" xmlns:wne="http://schemas.microsoft.com/office/word/2006/wordml" xmlns:wps="http://schemas.microsoft.com/office/word/2010/wordprocessingShape" mc:Ignorable="w14 w15 w16se w16cid w16 w16cex w16sdtdh w16du wp14">
+  <w:abstractNum w:abstractNumId="0" w15:restartNumberingAfterBreak="0">
+    <w:nsid w:val="44BA438B"/>
+    <w:multiLevelType w:val="hybridMultilevel"/>
+    <w:tmpl w:val="D55A94C8"/>
+    <w:lvl w:ilvl="0" w:tplc="0419000F">
+      <w:start w:val="1"/>
+      <w:numFmt w:val="decimal"/>
+      <w:lvlText w:val="%1."/>
+      <w:lvlJc w:val="left"/>
+      <w:pPr>
+        <w:ind w:left="1428" w:hanging="360"/>
+      </w:pPr>
+    </w:lvl>
+    <w:lvl w:ilvl="1" w:tplc="04190019" w:tentative="1">
+      <w:start w:val="1"/>
+      <w:numFmt w:val="lowerLetter"/>
+      <w:lvlText w:val="%2."/>
+      <w:lvlJc w:val="left"/>
+      <w:pPr>
+        <w:ind w:left="2148" w:hanging="360"/>
+      </w:pPr>
+    </w:lvl>
+    <w:lvl w:ilvl="2" w:tplc="0419001B" w:tentative="1">
+      <w:start w:val="1"/>
+      <w:numFmt w:val="lowerRoman"/>
+      <w:lvlText w:val="%3."/>
+      <w:lvlJc w:val="right"/>
+      <w:pPr>
+        <w:ind w:left="2868" w:hanging="180"/>
+      </w:pPr>
+    </w:lvl>
+    <w:lvl w:ilvl="3" w:tplc="0419000F" w:tentative="1">
+      <w:start w:val="1"/>
+      <w:numFmt w:val="decimal"/>
+      <w:lvlText w:val="%4."/>
+      <w:lvlJc w:val="left"/>
+      <w:pPr>
+        <w:ind w:left="3588" w:hanging="360"/>
+      </w:pPr>
+    </w:lvl>
+    <w:lvl w:ilvl="4" w:tplc="04190019" w:tentative="1">
+      <w:start w:val="1"/>
+      <w:numFmt w:val="lowerLetter"/>
+      <w:lvlText w:val="%5."/>
+      <w:lvlJc w:val="left"/>
+      <w:pPr>
+        <w:ind w:left="4308" w:hanging="360"/>
+      </w:pPr>
+    </w:lvl>
+    <w:lvl w:ilvl="5" w:tplc="0419001B" w:tentative="1">
+      <w:start w:val="1"/>
+      <w:numFmt w:val="lowerRoman"/>
+      <w:lvlText w:val="%6."/>
+      <w:lvlJc w:val="right"/>
+      <w:pPr>
+        <w:ind w:left="5028" w:hanging="180"/>
+      </w:pPr>
+    </w:lvl>
+    <w:lvl w:ilvl="6" w:tplc="0419000F" w:tentative="1">
+      <w:start w:val="1"/>
+      <w:numFmt w:val="decimal"/>
+      <w:lvlText w:val="%7."/>
+      <w:lvlJc w:val="left"/>
+      <w:pPr>
+        <w:ind w:left="5748" w:hanging="360"/>
+      </w:pPr>
+    </w:lvl>
+    <w:lvl w:ilvl="7" w:tplc="04190019" w:tentative="1">
+      <w:start w:val="1"/>
+      <w:numFmt w:val="lowerLetter"/>
+      <w:lvlText w:val="%8."/>
+      <w:lvlJc w:val="left"/>
+      <w:pPr>
+        <w:ind w:left="6468" w:hanging="360"/>
+      </w:pPr>
+    </w:lvl>
+    <w:lvl w:ilvl="8" w:tplc="0419001B" w:tentative="1">
+      <w:start w:val="1"/>
+      <w:numFmt w:val="lowerRoman"/>
+      <w:lvlText w:val="%9."/>
+      <w:lvlJc w:val="right"/>
+      <w:pPr>
+        <w:ind w:left="7188" w:hanging="180"/>
+      </w:pPr>
+    </w:lvl>
+  </w:abstractNum>
+  <w:abstractNum w:abstractNumId="1" w15:restartNumberingAfterBreak="0">
+    <w:nsid w:val="6B8C36E5"/>
+    <w:multiLevelType w:val="hybridMultilevel"/>
+    <w:tmpl w:val="1654E7B4"/>
+    <w:lvl w:ilvl="0" w:tplc="0419000F">
+      <w:start w:val="1"/>
+      <w:numFmt w:val="decimal"/>
+      <w:lvlText w:val="%1."/>
+      <w:lvlJc w:val="left"/>
+      <w:pPr>
+        <w:ind w:left="720" w:hanging="360"/>
+      </w:pPr>
+      <w:rPr>
+        <w:rFonts w:hint="default"/>
+      </w:rPr>
+    </w:lvl>
+    <w:lvl w:ilvl="1" w:tplc="04190019" w:tentative="1">
+      <w:start w:val="1"/>
+      <w:numFmt w:val="lowerLetter"/>
+      <w:lvlText w:val="%2."/>
+      <w:lvlJc w:val="left"/>
+      <w:pPr>
+        <w:ind w:left="1440" w:hanging="360"/>
+      </w:pPr>
+    </w:lvl>
+    <w:lvl w:ilvl="2" w:tplc="0419001B" w:tentative="1">
+      <w:start w:val="1"/>
+      <w:numFmt w:val="lowerRoman"/>
+      <w:lvlText w:val="%3."/>
+      <w:lvlJc w:val="right"/>
+      <w:pPr>
+        <w:ind w:left="2160" w:hanging="180"/>
+      </w:pPr>
+    </w:lvl>
+    <w:lvl w:ilvl="3" w:tplc="0419000F" w:tentative="1">
+      <w:start w:val="1"/>
+      <w:numFmt w:val="decimal"/>
+      <w:lvlText w:val="%4."/>
+      <w:lvlJc w:val="left"/>
+      <w:pPr>
+        <w:ind w:left="2880" w:hanging="360"/>
+      </w:pPr>
+    </w:lvl>
+    <w:lvl w:ilvl="4" w:tplc="04190019" w:tentative="1">
+      <w:start w:val="1"/>
+      <w:numFmt w:val="lowerLetter"/>
+      <w:lvlText w:val="%5."/>
+      <w:lvlJc w:val="left"/>
+      <w:pPr>
+        <w:ind w:left="3600" w:hanging="360"/>
+      </w:pPr>
+    </w:lvl>
+    <w:lvl w:ilvl="5" w:tplc="0419001B" w:tentative="1">
+      <w:start w:val="1"/>
+      <w:numFmt w:val="lowerRoman"/>
+      <w:lvlText w:val="%6."/>
+      <w:lvlJc w:val="right"/>
+      <w:pPr>
+        <w:ind w:left="4320" w:hanging="180"/>
+      </w:pPr>
+    </w:lvl>
+    <w:lvl w:ilvl="6" w:tplc="0419000F" w:tentative="1">
+      <w:start w:val="1"/>
+      <w:numFmt w:val="decimal"/>
+      <w:lvlText w:val="%7."/>
+      <w:lvlJc w:val="left"/>
+      <w:pPr>
+        <w:ind w:left="5040" w:hanging="360"/>
+      </w:pPr>
+    </w:lvl>
+    <w:lvl w:ilvl="7" w:tplc="04190019" w:tentative="1">
+      <w:start w:val="1"/>
+      <w:numFmt w:val="lowerLetter"/>
+      <w:lvlText w:val="%8."/>
+      <w:lvlJc w:val="left"/>
+      <w:pPr>
+        <w:ind w:left="5760" w:hanging="360"/>
+      </w:pPr>
+    </w:lvl>
+    <w:lvl w:ilvl="8" w:tplc="0419001B" w:tentative="1">
+      <w:start w:val="1"/>
+      <w:numFmt w:val="lowerRoman"/>
+      <w:lvlText w:val="%9."/>
+      <w:lvlJc w:val="right"/>
+      <w:pPr>
+        <w:ind w:left="6480" w:hanging="180"/>
+      </w:pPr>
+    </w:lvl>
+  </w:abstractNum>
+  <w:num w:numId="1" w16cid:durableId="1916744211">
+    <w:abstractNumId w:val="0"/>
+  </w:num>
+  <w:num w:numId="2" w16cid:durableId="1776557304">
+    <w:abstractNumId w:val="1"/>
+  </w:num>
+</w:numbering>
 </file>
 
 <file path=word/styles.xml><?xml version="1.0" encoding="utf-8"?>

</xml_diff>